<commit_message>
Atualiza documentacao tecnica (treino dos modelos)
</commit_message>
<xml_diff>
--- a/DOCUMENTACAO_TECNICA.docx
+++ b/DOCUMENTACAO_TECNICA.docx
@@ -8922,7 +8922,7 @@
                 <w:sz w:val="20"/>
                 <w:szCs w:val="20"/>
               </w:rPr>
-              <w:t xml:space="preserve">Guia do repositório (resumo, execução, arquivos, notebooks)</w:t>
+              <w:t xml:space="preserve">Guia do repositório (resumo, execução, treino, arquivos, notebooks)</w:t>
             </w:r>
           </w:p>
         </w:tc>
@@ -10421,7 +10421,7 @@
         <w:pStyle w:val="Heading2"/>
       </w:pPr>
       <w:r>
-        <w:t xml:space="preserve">9.5 Tecnologias utilizadas</w:t>
+        <w:t xml:space="preserve">9.5 Como (re)treinar os modelos (reprodutibilidade)</w:t>
       </w:r>
     </w:p>
     <w:p>
@@ -10433,6 +10433,150 @@
           <w:sz w:val="22"/>
           <w:szCs w:val="22"/>
         </w:rPr>
+        <w:t xml:space="preserve">Todos os modelos são reprodutíveis. A rede neural de toxicidade treina localmente (CPU); os modelos BERT/BERTimbau treinam no Google Colab com GPU gratuita.</w:t>
+      </w:r>
+    </w:p>
+    <w:p>
+      <w:pPr>
+        <w:pStyle w:val="Heading3"/>
+      </w:pPr>
+      <w:r>
+        <w:t xml:space="preserve">Rede neural de toxicidade (local)</w:t>
+      </w:r>
+    </w:p>
+    <w:p>
+      <w:pPr>
+        <w:spacing w:after="140" w:line="276"/>
+      </w:pPr>
+      <w:r>
+        <w:rPr>
+          <w:sz w:val="22"/>
+          <w:szCs w:val="22"/>
+        </w:rPr>
+        <w:t xml:space="preserve">Clone o ToLD-Br, instale scikit-learn, pandas, numpy, matplotlib e joblib, e rode o script treinar_rede_neural.py. Saída: modelo_rede_neural.joblib, figuras (curva de loss, matriz de confusão) e métricas.</w:t>
+      </w:r>
+    </w:p>
+    <w:p>
+      <w:pPr>
+        <w:pStyle w:val="Heading3"/>
+      </w:pPr>
+      <w:r>
+        <w:t xml:space="preserve">Modelos BERT (Google Colab, GPU) — os mesmos passos para os quatro notebooks</w:t>
+      </w:r>
+    </w:p>
+    <w:p>
+      <w:pPr>
+        <w:spacing w:after="140" w:line="276"/>
+      </w:pPr>
+      <w:r>
+        <w:rPr>
+          <w:b/>
+          <w:bCs/>
+          <w:sz w:val="22"/>
+          <w:szCs w:val="22"/>
+        </w:rPr>
+        <w:t xml:space="preserve">1. </w:t>
+      </w:r>
+      <w:r>
+        <w:rPr>
+          <w:sz w:val="22"/>
+          <w:szCs w:val="22"/>
+        </w:rPr>
+        <w:t xml:space="preserve">Abra o notebook no Google Colab.</w:t>
+      </w:r>
+    </w:p>
+    <w:p>
+      <w:pPr>
+        <w:spacing w:after="140" w:line="276"/>
+      </w:pPr>
+      <w:r>
+        <w:rPr>
+          <w:b/>
+          <w:bCs/>
+          <w:sz w:val="22"/>
+          <w:szCs w:val="22"/>
+        </w:rPr>
+        <w:t xml:space="preserve">2. </w:t>
+      </w:r>
+      <w:r>
+        <w:rPr>
+          <w:sz w:val="22"/>
+          <w:szCs w:val="22"/>
+        </w:rPr>
+        <w:t xml:space="preserve">Ambiente de execução → Alterar o tipo → GPU.</w:t>
+      </w:r>
+    </w:p>
+    <w:p>
+      <w:pPr>
+        <w:spacing w:after="140" w:line="276"/>
+      </w:pPr>
+      <w:r>
+        <w:rPr>
+          <w:b/>
+          <w:bCs/>
+          <w:sz w:val="22"/>
+          <w:szCs w:val="22"/>
+        </w:rPr>
+        <w:t xml:space="preserve">3. </w:t>
+      </w:r>
+      <w:r>
+        <w:rPr>
+          <w:sz w:val="22"/>
+          <w:szCs w:val="22"/>
+        </w:rPr>
+        <w:t xml:space="preserve">Ambiente de execução → Executar tudo.</w:t>
+      </w:r>
+    </w:p>
+    <w:p>
+      <w:pPr>
+        <w:spacing w:after="140" w:line="276"/>
+      </w:pPr>
+      <w:r>
+        <w:rPr>
+          <w:b/>
+          <w:bCs/>
+          <w:sz w:val="22"/>
+          <w:szCs w:val="22"/>
+        </w:rPr>
+        <w:t xml:space="preserve">4. </w:t>
+      </w:r>
+      <w:r>
+        <w:rPr>
+          <w:sz w:val="22"/>
+          <w:szCs w:val="22"/>
+        </w:rPr>
+        <w:t xml:space="preserve">As células finais baixam os resultados (figuras, JSONs e, no BERTimbau, o .zip do modelo usado pela página).</w:t>
+      </w:r>
+    </w:p>
+    <w:p>
+      <w:pPr>
+        <w:spacing w:after="140" w:line="276"/>
+      </w:pPr>
+      <w:r>
+        <w:rPr>
+          <w:sz w:val="22"/>
+          <w:szCs w:val="22"/>
+        </w:rPr>
+        <w:t xml:space="preserve">Reprodutibilidade: sementes fixas, splits documentados (split por deputado na inclinação) e limpeza de texto (remoção do cabeçalho com a sigla do partido).</w:t>
+      </w:r>
+    </w:p>
+    <w:p>
+      <w:pPr>
+        <w:pStyle w:val="Heading2"/>
+      </w:pPr>
+      <w:r>
+        <w:t xml:space="preserve">9.6 Tecnologias utilizadas</w:t>
+      </w:r>
+    </w:p>
+    <w:p>
+      <w:pPr>
+        <w:spacing w:after="140" w:line="276"/>
+      </w:pPr>
+      <w:r>
+        <w:rPr>
+          <w:sz w:val="22"/>
+          <w:szCs w:val="22"/>
+        </w:rPr>
         <w:t xml:space="preserve">Python 3; PyTorch e Hugging Face Transformers (modelos BERTimbau, BERTabaporu, mBERT); scikit-learn (baseline, métricas, splits); pandas e numpy (dados); matplotlib (gráficos); HTML/CSS/JavaScript (demonstração web). Bases: ToLD-Br (CC BY-SA 4.0) e API de dados abertos da Câmara dos Deputados.</w:t>
       </w:r>
     </w:p>
@@ -10441,7 +10585,7 @@
         <w:pStyle w:val="Heading2"/>
       </w:pPr>
       <w:r>
-        <w:t xml:space="preserve">9.6 Instruções gerais</w:t>
+        <w:t xml:space="preserve">9.7 Instruções gerais</w:t>
       </w:r>
     </w:p>
     <w:p>
@@ -10845,7 +10989,7 @@
         </w:rPr>
         <w:t xml:space="preserve">Portal de Dados Abertos da Câmara dos Deputados — </w:t>
       </w:r>
-      <w:hyperlink w:history="1" r:id="rIdre8eklnupkygzimgfxmfq">
+      <w:hyperlink w:history="1" r:id="rIdperhu3ffk4jz4dxmppzyq">
         <w:r>
           <w:rPr>
             <w:rStyle w:val="Hyperlink"/>

</xml_diff>

<commit_message>
Adiciona guia de leitura entre README, etapas e DOCX
</commit_message>
<xml_diff>
--- a/DOCUMENTACAO_TECNICA.docx
+++ b/DOCUMENTACAO_TECNICA.docx
@@ -669,6 +669,26 @@
     <w:p>
       <w:r>
         <w:br w:type="page"/>
+      </w:r>
+    </w:p>
+    <w:p>
+      <w:pPr>
+        <w:spacing w:after="140" w:line="276"/>
+      </w:pPr>
+      <w:r>
+        <w:rPr>
+          <w:b/>
+          <w:sz w:val="22"/>
+          <w:szCs w:val="22"/>
+        </w:rPr>
+        <w:t xml:space="preserve">Nota sobre esta documentação. </w:t>
+      </w:r>
+      <w:r>
+        <w:rPr>
+          <w:sz w:val="22"/>
+          <w:szCs w:val="22"/>
+        </w:rPr>
+        <w:t xml:space="preserve">Este é o relatório técnico consolidado do projeto. As Seções 1 a 7 reúnem em um só lugar, com figuras e tabelas, o conteúdo detalhado nos markdowns da pasta etapas/ (o raciocínio acadêmico, etapa a etapa). As Seções 8 a 10 (histórico de decisões; entregáveis e execução; conclusão) são exclusivas deste documento. Para instruções rápidas de uso e a estrutura do repositório, consulte o README.md.</w:t>
       </w:r>
     </w:p>
     <w:p>

</xml_diff>